<commit_message>
Generera uppdaterad lektion-4.docx med kedjebaserade scenariokort
Ny docx med visuella scenarioboxar (gul ram), zoom-ut-rutor (grön ram),
och kedjeformat där elevernas val påverkar nästa scenario.

Co-Authored-By: Claude Opus 4.6 <noreply@anthropic.com>
</commit_message>
<xml_diff>
--- a/Samhällskunskap/Ungas ekonomi/lektion-4.docx
+++ b/Samhällskunskap/Ungas ekonomi/lektion-4.docx
@@ -67,7 +67,7 @@
           <w:sz w:val="24"/>
           <w:szCs w:val="24"/>
         </w:rPr>
-        <w:t xml:space="preserve">Mål 4: Diskutera sambandet individ–samhälle</w:t>
+        <w:t xml:space="preserve">Mål 4: Diskutera sambandet individ–samhälle — hur individens ekonomiska beslut påverkar samhällsekonomin</w:t>
       </w:r>
     </w:p>
     <w:p>
@@ -93,7 +93,7 @@
           <w:sz w:val="24"/>
           <w:szCs w:val="24"/>
         </w:rPr>
-        <w:t xml:space="preserve">Förbered fyra scenariokort (utskrift, ett set per par)</w:t>
+        <w:t xml:space="preserve">Förbered scenariokort i kedjeformat (utskrift, ett set per par)</w:t>
       </w:r>
     </w:p>
     <w:p>
@@ -129,7 +129,43 @@
           <w:sz w:val="24"/>
           <w:szCs w:val="24"/>
         </w:rPr>
-        <w:t xml:space="preserve">Valfritt: Klarna-reklam och snabblåne-reklam för diskussion</w:t>
+        <w:t xml:space="preserve">Miniwhiteboard eller papper för uträkningar</w:t>
+      </w:r>
+    </w:p>
+    <w:p>
+      <w:pPr>
+        <w:pStyle w:val="ListParagraph"/>
+        <w:numPr>
+          <w:ilvl w:val="0"/>
+          <w:numId w:val="2"/>
+        </w:numPr>
+        <w:spacing w:after="60"/>
+      </w:pPr>
+      <w:r>
+        <w:rPr>
+          <w:rFonts w:ascii="Arial" w:cs="Arial" w:eastAsia="Arial" w:hAnsi="Arial"/>
+          <w:sz w:val="24"/>
+          <w:szCs w:val="24"/>
+        </w:rPr>
+        <w:t xml:space="preserve">Valfritt: skriv ut exempel på snabblåne-reklam och Klarna-reklam för diskussion</w:t>
+      </w:r>
+    </w:p>
+    <w:p>
+      <w:pPr>
+        <w:pStyle w:val="ListParagraph"/>
+        <w:numPr>
+          <w:ilvl w:val="0"/>
+          <w:numId w:val="2"/>
+        </w:numPr>
+        <w:spacing w:after="60"/>
+      </w:pPr>
+      <w:r>
+        <w:rPr>
+          <w:rFonts w:ascii="Arial" w:cs="Arial" w:eastAsia="Arial" w:hAnsi="Arial"/>
+          <w:sz w:val="24"/>
+          <w:szCs w:val="24"/>
+        </w:rPr>
+        <w:t xml:space="preserve">Förbered "Zoom ut"-frågorna (en per scenario) — kan visas på tavlan eller skrivas ut</w:t>
       </w:r>
     </w:p>
     <w:p>
@@ -503,7 +539,7 @@
                 <w:sz w:val="22"/>
                 <w:szCs w:val="22"/>
               </w:rPr>
-              <w:t xml:space="preserve">Oväntade utgifter. Låneformer: snabblån, avbetalning, Klarna. Ränta-på-ränta. Konkret: Alex lånar 10 000 kr till 35% ränta.</w:t>
+              <w:t xml:space="preserve">Oväntade utgifter, låneformer, ränta-på-ränta. Konkret: Alex lånar 10 000 kr till 35% ränta — vad kostar lånet totalt?</w:t>
             </w:r>
           </w:p>
         </w:tc>
@@ -586,7 +622,7 @@
                 <w:sz w:val="22"/>
                 <w:szCs w:val="22"/>
               </w:rPr>
-              <w:t xml:space="preserve">Scenarioanalys</w:t>
+              <w:t xml:space="preserve">Scenariokedja</w:t>
             </w:r>
           </w:p>
         </w:tc>
@@ -613,7 +649,7 @@
                 <w:sz w:val="22"/>
                 <w:szCs w:val="22"/>
               </w:rPr>
-              <w:t xml:space="preserve">I par: fyra scenariokort med moraliska och strukturella dimensioner. Minst 3 av 4 kort.</w:t>
+              <w:t xml:space="preserve">Scenarierna bygger på varandra — val i scenario 1 påverkar scenario 2, osv. Paren hinner minst 3 av 4.</w:t>
             </w:r>
           </w:p>
         </w:tc>
@@ -727,7 +763,7 @@
                 <w:sz w:val="22"/>
                 <w:szCs w:val="22"/>
               </w:rPr>
-              <w:t xml:space="preserve">Vilket scenario var svårast att enas om? Vems ansvar är det att unga inte hamnar i skuldfällan?</w:t>
+              <w:t xml:space="preserve">Jämför kedjorna: vilka par tog snabblånet — och hur påverkade det resten?</w:t>
             </w:r>
           </w:p>
         </w:tc>
@@ -853,7 +889,7 @@
         <w:pStyle w:val="Heading2"/>
       </w:pPr>
       <w:r>
-        <w:t xml:space="preserve">Scenariokort</w:t>
+        <w:t xml:space="preserve">Scenariokort — Kedjeformat</w:t>
       </w:r>
     </w:p>
     <w:p>
@@ -865,23 +901,1272 @@
           <w:rFonts w:ascii="Arial" w:cs="Arial" w:eastAsia="Arial" w:hAnsi="Arial"/>
           <w:b/>
           <w:bCs/>
-          <w:sz w:val="26"/>
-          <w:szCs w:val="26"/>
-        </w:rPr>
-        <w:t xml:space="preserve">Scenario 1: Tandläkaren</w:t>
-      </w:r>
-    </w:p>
-    <w:p>
-      <w:pPr>
-        <w:spacing w:after="120"/>
-      </w:pPr>
-      <w:r>
-        <w:rPr>
-          <w:rFonts w:ascii="Arial" w:cs="Arial" w:eastAsia="Arial" w:hAnsi="Arial"/>
-          <w:sz w:val="24"/>
-          <w:szCs w:val="24"/>
-        </w:rPr>
-        <w:t xml:space="preserve">Alex har ont i en tand. Akuttandvård kostar 4 200 kr. Alex har 1 800 kr på kontot. Nästa lön kommer om 18 dagar.</w:t>
+          <w:sz w:val="24"/>
+          <w:szCs w:val="24"/>
+        </w:rPr>
+        <w:t xml:space="preserve">Instruktion till eleverna: </w:t>
+      </w:r>
+      <w:r>
+        <w:rPr>
+          <w:rFonts w:ascii="Arial" w:cs="Arial" w:eastAsia="Arial" w:hAnsi="Arial"/>
+          <w:sz w:val="24"/>
+          <w:szCs w:val="24"/>
+        </w:rPr>
+        <w:t xml:space="preserve">Scenarierna hänger ihop. Arbeta i ordning — valet ni gör i scenario 1 påverkar Alex situation i scenario 2, och så vidare. Anteckna vilka val ni gör.</w:t>
+      </w:r>
+    </w:p>
+    <w:p>
+      <w:pPr>
+        <w:spacing w:after="200"/>
+      </w:pPr>
+    </w:p>
+    <w:tbl>
+      <w:tblPr>
+        <w:tblW w:type="dxa" w:w="9026"/>
+        <w:tblBorders>
+          <w:top w:val="single" w:color="auto" w:sz="4"/>
+          <w:left w:val="single" w:color="auto" w:sz="4"/>
+          <w:bottom w:val="single" w:color="auto" w:sz="4"/>
+          <w:right w:val="single" w:color="auto" w:sz="4"/>
+          <w:insideH w:val="single" w:color="auto" w:sz="4"/>
+          <w:insideV w:val="single" w:color="auto" w:sz="4"/>
+        </w:tblBorders>
+      </w:tblPr>
+      <w:tblGrid>
+        <w:gridCol w:w="9026"/>
+      </w:tblGrid>
+      <w:tr>
+        <w:tc>
+          <w:tcPr>
+            <w:tcW w:type="dxa" w:w="9026"/>
+            <w:tcBorders>
+              <w:top w:val="single" w:color="E0A800" w:sz="2"/>
+              <w:left w:val="single" w:color="E0A800" w:sz="2"/>
+              <w:bottom w:val="single" w:color="E0A800" w:sz="2"/>
+              <w:right w:val="single" w:color="E0A800" w:sz="2"/>
+            </w:tcBorders>
+            <w:shd w:fill="FFF8E1" w:val="clear"/>
+            <w:tcMar>
+              <w:top w:type="dxa" w:w="120"/>
+              <w:left w:type="dxa" w:w="200"/>
+              <w:bottom w:type="dxa" w:w="120"/>
+              <w:right w:type="dxa" w:w="200"/>
+            </w:tcMar>
+          </w:tcPr>
+          <w:p>
+            <w:pPr>
+              <w:spacing w:after="120"/>
+            </w:pPr>
+            <w:r>
+              <w:rPr>
+                <w:rFonts w:ascii="Arial" w:cs="Arial" w:eastAsia="Arial" w:hAnsi="Arial"/>
+                <w:b/>
+                <w:bCs/>
+                <w:color w:val="B8860B"/>
+                <w:sz w:val="28"/>
+                <w:szCs w:val="28"/>
+              </w:rPr>
+              <w:t xml:space="preserve">Scenario 1: Tandläkaren + höjd hyra (samtidigt)</w:t>
+            </w:r>
+          </w:p>
+          <w:p>
+            <w:pPr>
+              <w:spacing w:after="120"/>
+            </w:pPr>
+            <w:r>
+              <w:rPr>
+                <w:rFonts w:ascii="Arial" w:cs="Arial" w:eastAsia="Arial" w:hAnsi="Arial"/>
+                <w:sz w:val="24"/>
+                <w:szCs w:val="24"/>
+              </w:rPr>
+              <w:t xml:space="preserve">Alex har ont i en tand. Akuttandvård kostar 4 200 kr. Samma vecka meddelar hyresvärden att hyran höjs med 600 kr/mån från nästa månad. Alex har 1 800 kr på kontot och ett buffertsparande på 5 000 kr. Nästa lön kommer om 18 dagar.</w:t>
+            </w:r>
+          </w:p>
+          <w:p>
+            <w:pPr>
+              <w:spacing w:after="60"/>
+            </w:pPr>
+            <w:r>
+              <w:rPr>
+                <w:rFonts w:ascii="Arial" w:cs="Arial" w:eastAsia="Arial" w:hAnsi="Arial"/>
+                <w:b/>
+                <w:bCs/>
+                <w:sz w:val="24"/>
+                <w:szCs w:val="24"/>
+              </w:rPr>
+              <w:t xml:space="preserve">Alternativen:</w:t>
+            </w:r>
+          </w:p>
+          <w:p>
+            <w:pPr>
+              <w:pStyle w:val="ListParagraph"/>
+              <w:numPr>
+                <w:ilvl w:val="0"/>
+                <w:numId w:val="2"/>
+              </w:numPr>
+              <w:spacing w:after="60"/>
+            </w:pPr>
+            <w:r>
+              <w:rPr>
+                <w:rFonts w:ascii="Arial" w:cs="Arial" w:eastAsia="Arial" w:hAnsi="Arial"/>
+                <w:sz w:val="24"/>
+                <w:szCs w:val="24"/>
+              </w:rPr>
+              <w:t xml:space="preserve">(A) Ta ett snabblån på 5 000 kr (39% ränta, 3 mån avbetalning) — fixa tanden direkt, behåll bufferten intakt.</w:t>
+            </w:r>
+          </w:p>
+          <w:p>
+            <w:pPr>
+              <w:pStyle w:val="ListParagraph"/>
+              <w:numPr>
+                <w:ilvl w:val="0"/>
+                <w:numId w:val="2"/>
+              </w:numPr>
+              <w:spacing w:after="60"/>
+            </w:pPr>
+            <w:r>
+              <w:rPr>
+                <w:rFonts w:ascii="Arial" w:cs="Arial" w:eastAsia="Arial" w:hAnsi="Arial"/>
+                <w:sz w:val="24"/>
+                <w:szCs w:val="24"/>
+              </w:rPr>
+              <w:t xml:space="preserve">(B) Använd bufferten — fixa tanden, men stå utan säkerhetsnät. Ingen buffert kvar.</w:t>
+            </w:r>
+          </w:p>
+          <w:p>
+            <w:pPr>
+              <w:pStyle w:val="ListParagraph"/>
+              <w:numPr>
+                <w:ilvl w:val="0"/>
+                <w:numId w:val="2"/>
+              </w:numPr>
+              <w:spacing w:after="60"/>
+            </w:pPr>
+            <w:r>
+              <w:rPr>
+                <w:rFonts w:ascii="Arial" w:cs="Arial" w:eastAsia="Arial" w:hAnsi="Arial"/>
+                <w:sz w:val="24"/>
+                <w:szCs w:val="24"/>
+              </w:rPr>
+              <w:t xml:space="preserve">(C) Vänta till lönen, stå ut med smärtan — riskera att det blir värre (rotbehandling: 8 500 kr).</w:t>
+            </w:r>
+          </w:p>
+          <w:p>
+            <w:pPr>
+              <w:pStyle w:val="ListParagraph"/>
+              <w:numPr>
+                <w:ilvl w:val="0"/>
+                <w:numId w:val="2"/>
+              </w:numPr>
+              <w:spacing w:after="120"/>
+            </w:pPr>
+            <w:r>
+              <w:rPr>
+                <w:rFonts w:ascii="Arial" w:cs="Arial" w:eastAsia="Arial" w:hAnsi="Arial"/>
+                <w:sz w:val="24"/>
+                <w:szCs w:val="24"/>
+              </w:rPr>
+              <w:t xml:space="preserve">(D) Fråga föräldrarna. Alex föräldrar har själva tight ekonomi — det skulle skapa skuld (inte ekonomisk, utan moralisk).</w:t>
+            </w:r>
+          </w:p>
+          <w:p>
+            <w:pPr>
+              <w:spacing w:after="80"/>
+            </w:pPr>
+            <w:r>
+              <w:rPr>
+                <w:rFonts w:ascii="Arial" w:cs="Arial" w:eastAsia="Arial" w:hAnsi="Arial"/>
+                <w:b/>
+                <w:bCs/>
+                <w:sz w:val="24"/>
+                <w:szCs w:val="24"/>
+              </w:rPr>
+              <w:t xml:space="preserve">Diskussionsfråga: </w:t>
+            </w:r>
+            <w:r>
+              <w:rPr>
+                <w:rFonts w:ascii="Arial" w:cs="Arial" w:eastAsia="Arial" w:hAnsi="Arial"/>
+                <w:i/>
+                <w:iCs/>
+                <w:sz w:val="24"/>
+                <w:szCs w:val="24"/>
+              </w:rPr>
+              <w:t xml:space="preserve">Alla alternativ har ett pris. Vad kostar snabblånet i kronor? Vad kostar det att vänta i risk? Vad kostar det att fråga föräldrarna i relation? Vilken typ av kostnad väger tyngst?</w:t>
+            </w:r>
+          </w:p>
+          <w:p>
+            <w:pPr>
+              <w:spacing w:after="80"/>
+            </w:pPr>
+            <w:r>
+              <w:rPr>
+                <w:rFonts w:ascii="Arial" w:cs="Arial" w:eastAsia="Arial" w:hAnsi="Arial"/>
+                <w:b/>
+                <w:bCs/>
+                <w:color w:val="B8860B"/>
+                <w:sz w:val="24"/>
+                <w:szCs w:val="24"/>
+              </w:rPr>
+              <w:t xml:space="preserve">Anteckna ert val — det påverkar scenario 2.</w:t>
+            </w:r>
+          </w:p>
+        </w:tc>
+      </w:tr>
+    </w:tbl>
+    <w:p>
+      <w:pPr>
+        <w:spacing w:after="200"/>
+      </w:pPr>
+    </w:p>
+    <w:tbl>
+      <w:tblPr>
+        <w:tblW w:type="dxa" w:w="9026"/>
+        <w:tblBorders>
+          <w:top w:val="single" w:color="auto" w:sz="4"/>
+          <w:left w:val="single" w:color="auto" w:sz="4"/>
+          <w:bottom w:val="single" w:color="auto" w:sz="4"/>
+          <w:right w:val="single" w:color="auto" w:sz="4"/>
+          <w:insideH w:val="single" w:color="auto" w:sz="4"/>
+          <w:insideV w:val="single" w:color="auto" w:sz="4"/>
+        </w:tblBorders>
+      </w:tblPr>
+      <w:tblGrid>
+        <w:gridCol w:w="9026"/>
+      </w:tblGrid>
+      <w:tr>
+        <w:tc>
+          <w:tcPr>
+            <w:tcW w:type="dxa" w:w="9026"/>
+            <w:tcBorders>
+              <w:top w:val="single" w:color="4CAF50" w:sz="2"/>
+              <w:left w:val="single" w:color="4CAF50" w:sz="2"/>
+              <w:bottom w:val="single" w:color="4CAF50" w:sz="2"/>
+              <w:right w:val="single" w:color="4CAF50" w:sz="2"/>
+            </w:tcBorders>
+            <w:shd w:fill="E8F5E9" w:val="clear"/>
+            <w:tcMar>
+              <w:top w:type="dxa" w:w="100"/>
+              <w:left w:type="dxa" w:w="200"/>
+              <w:bottom w:type="dxa" w:w="100"/>
+              <w:right w:type="dxa" w:w="200"/>
+            </w:tcMar>
+          </w:tcPr>
+          <w:p>
+            <w:pPr>
+              <w:spacing w:after="60"/>
+            </w:pPr>
+            <w:r>
+              <w:rPr>
+                <w:rFonts w:ascii="Arial" w:cs="Arial" w:eastAsia="Arial" w:hAnsi="Arial"/>
+                <w:b/>
+                <w:bCs/>
+                <w:color w:val="2E7D32"/>
+                <w:sz w:val="22"/>
+                <w:szCs w:val="22"/>
+              </w:rPr>
+              <w:t xml:space="preserve">ZOOM UT: </w:t>
+            </w:r>
+            <w:r>
+              <w:rPr>
+                <w:rFonts w:ascii="Arial" w:cs="Arial" w:eastAsia="Arial" w:hAnsi="Arial"/>
+                <w:i/>
+                <w:iCs/>
+                <w:color w:val="2E7D32"/>
+                <w:sz w:val="22"/>
+                <w:szCs w:val="22"/>
+              </w:rPr>
+              <w:t xml:space="preserve">Om 30% av unga saknar buffertsparande — vad innebär det för snabblånebranschen? Vem tjänar pengar på att unga inte har marginaler?</w:t>
+            </w:r>
+          </w:p>
+        </w:tc>
+      </w:tr>
+    </w:tbl>
+    <w:p>
+      <w:r>
+        <w:br w:type="page"/>
+      </w:r>
+    </w:p>
+    <w:tbl>
+      <w:tblPr>
+        <w:tblW w:type="dxa" w:w="9026"/>
+        <w:tblBorders>
+          <w:top w:val="single" w:color="auto" w:sz="4"/>
+          <w:left w:val="single" w:color="auto" w:sz="4"/>
+          <w:bottom w:val="single" w:color="auto" w:sz="4"/>
+          <w:right w:val="single" w:color="auto" w:sz="4"/>
+          <w:insideH w:val="single" w:color="auto" w:sz="4"/>
+          <w:insideV w:val="single" w:color="auto" w:sz="4"/>
+        </w:tblBorders>
+      </w:tblPr>
+      <w:tblGrid>
+        <w:gridCol w:w="9026"/>
+      </w:tblGrid>
+      <w:tr>
+        <w:tc>
+          <w:tcPr>
+            <w:tcW w:type="dxa" w:w="9026"/>
+            <w:tcBorders>
+              <w:top w:val="single" w:color="E0A800" w:sz="2"/>
+              <w:left w:val="single" w:color="E0A800" w:sz="2"/>
+              <w:bottom w:val="single" w:color="E0A800" w:sz="2"/>
+              <w:right w:val="single" w:color="E0A800" w:sz="2"/>
+            </w:tcBorders>
+            <w:shd w:fill="FFF8E1" w:val="clear"/>
+            <w:tcMar>
+              <w:top w:type="dxa" w:w="120"/>
+              <w:left w:type="dxa" w:w="200"/>
+              <w:bottom w:type="dxa" w:w="120"/>
+              <w:right w:type="dxa" w:w="200"/>
+            </w:tcMar>
+          </w:tcPr>
+          <w:p>
+            <w:pPr>
+              <w:spacing w:after="120"/>
+            </w:pPr>
+            <w:r>
+              <w:rPr>
+                <w:rFonts w:ascii="Arial" w:cs="Arial" w:eastAsia="Arial" w:hAnsi="Arial"/>
+                <w:b/>
+                <w:bCs/>
+                <w:color w:val="B8860B"/>
+                <w:sz w:val="28"/>
+                <w:szCs w:val="28"/>
+              </w:rPr>
+              <w:t xml:space="preserve">Scenario 2: Kompisen som behöver hjälp (konsekvenserna följer med)</w:t>
+            </w:r>
+          </w:p>
+          <w:p>
+            <w:pPr>
+              <w:spacing w:after="80"/>
+            </w:pPr>
+            <w:r>
+              <w:rPr>
+                <w:rFonts w:ascii="Arial" w:cs="Arial" w:eastAsia="Arial" w:hAnsi="Arial"/>
+                <w:b/>
+                <w:bCs/>
+                <w:sz w:val="24"/>
+                <w:szCs w:val="24"/>
+              </w:rPr>
+              <w:t xml:space="preserve">Två veckor senare. Resultatet av ert val i scenario 1:</w:t>
+            </w:r>
+          </w:p>
+          <w:p>
+            <w:pPr>
+              <w:pStyle w:val="ListParagraph"/>
+              <w:numPr>
+                <w:ilvl w:val="0"/>
+                <w:numId w:val="2"/>
+              </w:numPr>
+              <w:spacing w:after="60"/>
+            </w:pPr>
+            <w:r>
+              <w:rPr>
+                <w:rFonts w:ascii="Arial" w:cs="Arial" w:eastAsia="Arial" w:hAnsi="Arial"/>
+                <w:i/>
+                <w:iCs/>
+                <w:sz w:val="24"/>
+                <w:szCs w:val="24"/>
+              </w:rPr>
+              <w:t xml:space="preserve">Om ni valde A (snabblån): </w:t>
+            </w:r>
+            <w:r>
+              <w:rPr>
+                <w:rFonts w:ascii="Arial" w:cs="Arial" w:eastAsia="Arial" w:hAnsi="Arial"/>
+                <w:sz w:val="24"/>
+                <w:szCs w:val="24"/>
+              </w:rPr>
+              <w:t xml:space="preserve">Alex betalar 1 780 kr/mån i 3 månader på lånet. Bufferten är kvar, men budgeten är pressad.</w:t>
+            </w:r>
+          </w:p>
+          <w:p>
+            <w:pPr>
+              <w:pStyle w:val="ListParagraph"/>
+              <w:numPr>
+                <w:ilvl w:val="0"/>
+                <w:numId w:val="2"/>
+              </w:numPr>
+              <w:spacing w:after="60"/>
+            </w:pPr>
+            <w:r>
+              <w:rPr>
+                <w:rFonts w:ascii="Arial" w:cs="Arial" w:eastAsia="Arial" w:hAnsi="Arial"/>
+                <w:i/>
+                <w:iCs/>
+                <w:sz w:val="24"/>
+                <w:szCs w:val="24"/>
+              </w:rPr>
+              <w:t xml:space="preserve">Om ni valde B (bufferten): </w:t>
+            </w:r>
+            <w:r>
+              <w:rPr>
+                <w:rFonts w:ascii="Arial" w:cs="Arial" w:eastAsia="Arial" w:hAnsi="Arial"/>
+                <w:sz w:val="24"/>
+                <w:szCs w:val="24"/>
+              </w:rPr>
+              <w:t xml:space="preserve">Tanden är fixad, men Alex har 0 kr i buffert. Ekonomin är sårbar.</w:t>
+            </w:r>
+          </w:p>
+          <w:p>
+            <w:pPr>
+              <w:pStyle w:val="ListParagraph"/>
+              <w:numPr>
+                <w:ilvl w:val="0"/>
+                <w:numId w:val="2"/>
+              </w:numPr>
+              <w:spacing w:after="60"/>
+            </w:pPr>
+            <w:r>
+              <w:rPr>
+                <w:rFonts w:ascii="Arial" w:cs="Arial" w:eastAsia="Arial" w:hAnsi="Arial"/>
+                <w:i/>
+                <w:iCs/>
+                <w:sz w:val="24"/>
+                <w:szCs w:val="24"/>
+              </w:rPr>
+              <w:t xml:space="preserve">Om ni valde C (vänta): </w:t>
+            </w:r>
+            <w:r>
+              <w:rPr>
+                <w:rFonts w:ascii="Arial" w:cs="Arial" w:eastAsia="Arial" w:hAnsi="Arial"/>
+                <w:sz w:val="24"/>
+                <w:szCs w:val="24"/>
+              </w:rPr>
+              <w:t xml:space="preserve">Tanden blev värre. Nu behöver Alex en rotbehandling för 8 500 kr — och har fortfarande 1 800 kr.</w:t>
+            </w:r>
+          </w:p>
+          <w:p>
+            <w:pPr>
+              <w:pStyle w:val="ListParagraph"/>
+              <w:numPr>
+                <w:ilvl w:val="0"/>
+                <w:numId w:val="2"/>
+              </w:numPr>
+              <w:spacing w:after="120"/>
+            </w:pPr>
+            <w:r>
+              <w:rPr>
+                <w:rFonts w:ascii="Arial" w:cs="Arial" w:eastAsia="Arial" w:hAnsi="Arial"/>
+                <w:i/>
+                <w:iCs/>
+                <w:sz w:val="24"/>
+                <w:szCs w:val="24"/>
+              </w:rPr>
+              <w:t xml:space="preserve">Om ni valde D (föräldrarna): </w:t>
+            </w:r>
+            <w:r>
+              <w:rPr>
+                <w:rFonts w:ascii="Arial" w:cs="Arial" w:eastAsia="Arial" w:hAnsi="Arial"/>
+                <w:sz w:val="24"/>
+                <w:szCs w:val="24"/>
+              </w:rPr>
+              <w:t xml:space="preserve">Tanden är fixad, bufferten kvar, men Alex mamma ringde igår och nämnde att "det börjar bli svårt hemma också".</w:t>
+            </w:r>
+          </w:p>
+          <w:p>
+            <w:pPr>
+              <w:spacing w:after="80"/>
+            </w:pPr>
+            <w:r>
+              <w:rPr>
+                <w:rFonts w:ascii="Arial" w:cs="Arial" w:eastAsia="Arial" w:hAnsi="Arial"/>
+                <w:b/>
+                <w:bCs/>
+                <w:sz w:val="24"/>
+                <w:szCs w:val="24"/>
+              </w:rPr>
+              <w:t xml:space="preserve">Ny situation: </w:t>
+            </w:r>
+            <w:r>
+              <w:rPr>
+                <w:rFonts w:ascii="Arial" w:cs="Arial" w:eastAsia="Arial" w:hAnsi="Arial"/>
+                <w:sz w:val="24"/>
+                <w:szCs w:val="24"/>
+              </w:rPr>
+              <w:t xml:space="preserve">Alex kompis Dani har blivit av med sitt jobb och kan inte betala hyran — 5 000 kr. Dani frågar Alex om hjälp. Samtidigt har Alex arbetsgivare meddelat att arbetstiden skärs ned 25% nästa månad på grund av vikande försäljning. Alex inkomst sjunker från 17 600 kr till ca 13 200 kr netto.</w:t>
+            </w:r>
+          </w:p>
+          <w:p>
+            <w:pPr>
+              <w:spacing w:after="80"/>
+            </w:pPr>
+            <w:r>
+              <w:rPr>
+                <w:rFonts w:ascii="Arial" w:cs="Arial" w:eastAsia="Arial" w:hAnsi="Arial"/>
+                <w:b/>
+                <w:bCs/>
+                <w:sz w:val="24"/>
+                <w:szCs w:val="24"/>
+              </w:rPr>
+              <w:t xml:space="preserve">Diskussionsfråga: </w:t>
+            </w:r>
+            <w:r>
+              <w:rPr>
+                <w:rFonts w:ascii="Arial" w:cs="Arial" w:eastAsia="Arial" w:hAnsi="Arial"/>
+                <w:i/>
+                <w:iCs/>
+                <w:sz w:val="24"/>
+                <w:szCs w:val="24"/>
+              </w:rPr>
+              <w:t xml:space="preserve">Hur förändrar Alex nuvarande situation (från scenario 1) valmöjligheterna? Är det lättare att vara "en bra vän" när man själv har marginaler? Vad händer med vänskapen om Alex säger nej?</w:t>
+            </w:r>
+          </w:p>
+        </w:tc>
+      </w:tr>
+    </w:tbl>
+    <w:p>
+      <w:pPr>
+        <w:spacing w:after="200"/>
+      </w:pPr>
+    </w:p>
+    <w:tbl>
+      <w:tblPr>
+        <w:tblW w:type="dxa" w:w="9026"/>
+        <w:tblBorders>
+          <w:top w:val="single" w:color="auto" w:sz="4"/>
+          <w:left w:val="single" w:color="auto" w:sz="4"/>
+          <w:bottom w:val="single" w:color="auto" w:sz="4"/>
+          <w:right w:val="single" w:color="auto" w:sz="4"/>
+          <w:insideH w:val="single" w:color="auto" w:sz="4"/>
+          <w:insideV w:val="single" w:color="auto" w:sz="4"/>
+        </w:tblBorders>
+      </w:tblPr>
+      <w:tblGrid>
+        <w:gridCol w:w="9026"/>
+      </w:tblGrid>
+      <w:tr>
+        <w:tc>
+          <w:tcPr>
+            <w:tcW w:type="dxa" w:w="9026"/>
+            <w:tcBorders>
+              <w:top w:val="single" w:color="4CAF50" w:sz="2"/>
+              <w:left w:val="single" w:color="4CAF50" w:sz="2"/>
+              <w:bottom w:val="single" w:color="4CAF50" w:sz="2"/>
+              <w:right w:val="single" w:color="4CAF50" w:sz="2"/>
+            </w:tcBorders>
+            <w:shd w:fill="E8F5E9" w:val="clear"/>
+            <w:tcMar>
+              <w:top w:type="dxa" w:w="100"/>
+              <w:left w:type="dxa" w:w="200"/>
+              <w:bottom w:type="dxa" w:w="100"/>
+              <w:right w:type="dxa" w:w="200"/>
+            </w:tcMar>
+          </w:tcPr>
+          <w:p>
+            <w:pPr>
+              <w:spacing w:after="60"/>
+            </w:pPr>
+            <w:r>
+              <w:rPr>
+                <w:rFonts w:ascii="Arial" w:cs="Arial" w:eastAsia="Arial" w:hAnsi="Arial"/>
+                <w:b/>
+                <w:bCs/>
+                <w:color w:val="2E7D32"/>
+                <w:sz w:val="22"/>
+                <w:szCs w:val="22"/>
+              </w:rPr>
+              <w:t xml:space="preserve">ZOOM UT: </w:t>
+            </w:r>
+            <w:r>
+              <w:rPr>
+                <w:rFonts w:ascii="Arial" w:cs="Arial" w:eastAsia="Arial" w:hAnsi="Arial"/>
+                <w:i/>
+                <w:iCs/>
+                <w:color w:val="2E7D32"/>
+                <w:sz w:val="22"/>
+                <w:szCs w:val="22"/>
+              </w:rPr>
+              <w:t xml:space="preserve">Under en lågkonjunktur skärs arbetstider ned för hundratusentals unga samtidigt. Vad händer med konsumtionen i kretsloppet? Kan det förvärra lågkonjunkturen — och i så fall hur?</w:t>
+            </w:r>
+          </w:p>
+        </w:tc>
+      </w:tr>
+    </w:tbl>
+    <w:p>
+      <w:r>
+        <w:br w:type="page"/>
+      </w:r>
+    </w:p>
+    <w:tbl>
+      <w:tblPr>
+        <w:tblW w:type="dxa" w:w="9026"/>
+        <w:tblBorders>
+          <w:top w:val="single" w:color="auto" w:sz="4"/>
+          <w:left w:val="single" w:color="auto" w:sz="4"/>
+          <w:bottom w:val="single" w:color="auto" w:sz="4"/>
+          <w:right w:val="single" w:color="auto" w:sz="4"/>
+          <w:insideH w:val="single" w:color="auto" w:sz="4"/>
+          <w:insideV w:val="single" w:color="auto" w:sz="4"/>
+        </w:tblBorders>
+      </w:tblPr>
+      <w:tblGrid>
+        <w:gridCol w:w="9026"/>
+      </w:tblGrid>
+      <w:tr>
+        <w:tc>
+          <w:tcPr>
+            <w:tcW w:type="dxa" w:w="9026"/>
+            <w:tcBorders>
+              <w:top w:val="single" w:color="E0A800" w:sz="2"/>
+              <w:left w:val="single" w:color="E0A800" w:sz="2"/>
+              <w:bottom w:val="single" w:color="E0A800" w:sz="2"/>
+              <w:right w:val="single" w:color="E0A800" w:sz="2"/>
+            </w:tcBorders>
+            <w:shd w:fill="FFF8E1" w:val="clear"/>
+            <w:tcMar>
+              <w:top w:type="dxa" w:w="120"/>
+              <w:left w:type="dxa" w:w="200"/>
+              <w:bottom w:type="dxa" w:w="120"/>
+              <w:right w:type="dxa" w:w="200"/>
+            </w:tcMar>
+          </w:tcPr>
+          <w:p>
+            <w:pPr>
+              <w:spacing w:after="120"/>
+            </w:pPr>
+            <w:r>
+              <w:rPr>
+                <w:rFonts w:ascii="Arial" w:cs="Arial" w:eastAsia="Arial" w:hAnsi="Arial"/>
+                <w:b/>
+                <w:bCs/>
+                <w:color w:val="B8860B"/>
+                <w:sz w:val="28"/>
+                <w:szCs w:val="28"/>
+              </w:rPr>
+              <w:t xml:space="preserve">Scenario 3: Skuldspiralens logik (flera tryck samtidigt)</w:t>
+            </w:r>
+          </w:p>
+          <w:p>
+            <w:pPr>
+              <w:spacing w:after="80"/>
+            </w:pPr>
+            <w:r>
+              <w:rPr>
+                <w:rFonts w:ascii="Arial" w:cs="Arial" w:eastAsia="Arial" w:hAnsi="Arial"/>
+                <w:b/>
+                <w:bCs/>
+                <w:sz w:val="24"/>
+                <w:szCs w:val="24"/>
+              </w:rPr>
+              <w:t xml:space="preserve">En månad senare. Alex har nu:</w:t>
+            </w:r>
+          </w:p>
+          <w:p>
+            <w:pPr>
+              <w:pStyle w:val="ListParagraph"/>
+              <w:numPr>
+                <w:ilvl w:val="0"/>
+                <w:numId w:val="2"/>
+              </w:numPr>
+              <w:spacing w:after="40"/>
+            </w:pPr>
+            <w:r>
+              <w:rPr>
+                <w:rFonts w:ascii="Arial" w:cs="Arial" w:eastAsia="Arial" w:hAnsi="Arial"/>
+                <w:sz w:val="24"/>
+                <w:szCs w:val="24"/>
+              </w:rPr>
+              <w:t xml:space="preserve">Eventuellt ett snabblån (från scenario 1)</w:t>
+            </w:r>
+          </w:p>
+          <w:p>
+            <w:pPr>
+              <w:pStyle w:val="ListParagraph"/>
+              <w:numPr>
+                <w:ilvl w:val="0"/>
+                <w:numId w:val="2"/>
+              </w:numPr>
+              <w:spacing w:after="40"/>
+            </w:pPr>
+            <w:r>
+              <w:rPr>
+                <w:rFonts w:ascii="Arial" w:cs="Arial" w:eastAsia="Arial" w:hAnsi="Arial"/>
+                <w:sz w:val="24"/>
+                <w:szCs w:val="24"/>
+              </w:rPr>
+              <w:t xml:space="preserve">Eventuellt lånat ut pengar till Dani (som inte betalat tillbaka)</w:t>
+            </w:r>
+          </w:p>
+          <w:p>
+            <w:pPr>
+              <w:pStyle w:val="ListParagraph"/>
+              <w:numPr>
+                <w:ilvl w:val="0"/>
+                <w:numId w:val="2"/>
+              </w:numPr>
+              <w:spacing w:after="40"/>
+            </w:pPr>
+            <w:r>
+              <w:rPr>
+                <w:rFonts w:ascii="Arial" w:cs="Arial" w:eastAsia="Arial" w:hAnsi="Arial"/>
+                <w:sz w:val="24"/>
+                <w:szCs w:val="24"/>
+              </w:rPr>
+              <w:t xml:space="preserve">25% mindre i inkomst</w:t>
+            </w:r>
+          </w:p>
+          <w:p>
+            <w:pPr>
+              <w:pStyle w:val="ListParagraph"/>
+              <w:numPr>
+                <w:ilvl w:val="0"/>
+                <w:numId w:val="2"/>
+              </w:numPr>
+              <w:spacing w:after="40"/>
+            </w:pPr>
+            <w:r>
+              <w:rPr>
+                <w:rFonts w:ascii="Arial" w:cs="Arial" w:eastAsia="Arial" w:hAnsi="Arial"/>
+                <w:sz w:val="24"/>
+                <w:szCs w:val="24"/>
+              </w:rPr>
+              <w:t xml:space="preserve">600 kr högre hyra</w:t>
+            </w:r>
+          </w:p>
+          <w:p>
+            <w:pPr>
+              <w:pStyle w:val="ListParagraph"/>
+              <w:numPr>
+                <w:ilvl w:val="0"/>
+                <w:numId w:val="2"/>
+              </w:numPr>
+              <w:spacing w:after="120"/>
+            </w:pPr>
+            <w:r>
+              <w:rPr>
+                <w:rFonts w:ascii="Arial" w:cs="Arial" w:eastAsia="Arial" w:hAnsi="Arial"/>
+                <w:b/>
+                <w:bCs/>
+                <w:sz w:val="24"/>
+                <w:szCs w:val="24"/>
+              </w:rPr>
+              <w:t xml:space="preserve">Sammanlagt: Alex budget går inte ihop. Det saknas ca 3 000–5 000 kr varje månad.</w:t>
+            </w:r>
+          </w:p>
+          <w:p>
+            <w:pPr>
+              <w:spacing w:after="80"/>
+            </w:pPr>
+            <w:r>
+              <w:rPr>
+                <w:rFonts w:ascii="Arial" w:cs="Arial" w:eastAsia="Arial" w:hAnsi="Arial"/>
+                <w:b/>
+                <w:bCs/>
+                <w:sz w:val="24"/>
+                <w:szCs w:val="24"/>
+              </w:rPr>
+              <w:t xml:space="preserve">Tre saker händer samma vecka:</w:t>
+            </w:r>
+          </w:p>
+          <w:p>
+            <w:pPr>
+              <w:pStyle w:val="ListParagraph"/>
+              <w:numPr>
+                <w:ilvl w:val="0"/>
+                <w:numId w:val="2"/>
+              </w:numPr>
+              <w:spacing w:after="60"/>
+            </w:pPr>
+            <w:r>
+              <w:rPr>
+                <w:rFonts w:ascii="Arial" w:cs="Arial" w:eastAsia="Arial" w:hAnsi="Arial"/>
+                <w:sz w:val="24"/>
+                <w:szCs w:val="24"/>
+              </w:rPr>
+              <w:t xml:space="preserve">1. Alex jobbarkompisar planerar en weekend till Köpenhamn (4 000 kr). "Kom igen, du behöver det, lägg det på Klarna."</w:t>
+            </w:r>
+          </w:p>
+          <w:p>
+            <w:pPr>
+              <w:pStyle w:val="ListParagraph"/>
+              <w:numPr>
+                <w:ilvl w:val="0"/>
+                <w:numId w:val="2"/>
+              </w:numPr>
+              <w:spacing w:after="60"/>
+            </w:pPr>
+            <w:r>
+              <w:rPr>
+                <w:rFonts w:ascii="Arial" w:cs="Arial" w:eastAsia="Arial" w:hAnsi="Arial"/>
+                <w:sz w:val="24"/>
+                <w:szCs w:val="24"/>
+              </w:rPr>
+              <w:t xml:space="preserve">2. Alex mobil går sönder. En ny kostar 4 500 kr, en begagnad 1 800 kr. Mobilen behövs för jobb (schemat skickas via app).</w:t>
+            </w:r>
+          </w:p>
+          <w:p>
+            <w:pPr>
+              <w:pStyle w:val="ListParagraph"/>
+              <w:numPr>
+                <w:ilvl w:val="0"/>
+                <w:numId w:val="2"/>
+              </w:numPr>
+              <w:spacing w:after="120"/>
+            </w:pPr>
+            <w:r>
+              <w:rPr>
+                <w:rFonts w:ascii="Arial" w:cs="Arial" w:eastAsia="Arial" w:hAnsi="Arial"/>
+                <w:sz w:val="24"/>
+                <w:szCs w:val="24"/>
+              </w:rPr>
+              <w:t xml:space="preserve">3. Ett brev från Kronofogden: Alex har en obetald räkning på 2 200 kr (glömd tandvårdsräkning från scenario 1). Betalningsanmärkning hotar om den inte betalas inom 14 dagar.</w:t>
+            </w:r>
+          </w:p>
+          <w:p>
+            <w:pPr>
+              <w:spacing w:after="80"/>
+            </w:pPr>
+            <w:r>
+              <w:rPr>
+                <w:rFonts w:ascii="Arial" w:cs="Arial" w:eastAsia="Arial" w:hAnsi="Arial"/>
+                <w:b/>
+                <w:bCs/>
+                <w:sz w:val="24"/>
+                <w:szCs w:val="24"/>
+              </w:rPr>
+              <w:t xml:space="preserve">Diskussionsfråga: </w:t>
+            </w:r>
+            <w:r>
+              <w:rPr>
+                <w:rFonts w:ascii="Arial" w:cs="Arial" w:eastAsia="Arial" w:hAnsi="Arial"/>
+                <w:i/>
+                <w:iCs/>
+                <w:sz w:val="24"/>
+                <w:szCs w:val="24"/>
+              </w:rPr>
+              <w:t xml:space="preserve">Alex har tre akuta problem och pengar till noll av dem. Vad prioriterar ni — och vad offrar ni? Finns det ett "rätt" svar? Hur påverkar social press (Köpenhamn) beslutet trots att det objektivt sett är det minst akuta problemet?</w:t>
+            </w:r>
+          </w:p>
+        </w:tc>
+      </w:tr>
+    </w:tbl>
+    <w:p>
+      <w:pPr>
+        <w:spacing w:after="200"/>
+      </w:pPr>
+    </w:p>
+    <w:tbl>
+      <w:tblPr>
+        <w:tblW w:type="dxa" w:w="9026"/>
+        <w:tblBorders>
+          <w:top w:val="single" w:color="auto" w:sz="4"/>
+          <w:left w:val="single" w:color="auto" w:sz="4"/>
+          <w:bottom w:val="single" w:color="auto" w:sz="4"/>
+          <w:right w:val="single" w:color="auto" w:sz="4"/>
+          <w:insideH w:val="single" w:color="auto" w:sz="4"/>
+          <w:insideV w:val="single" w:color="auto" w:sz="4"/>
+        </w:tblBorders>
+      </w:tblPr>
+      <w:tblGrid>
+        <w:gridCol w:w="9026"/>
+      </w:tblGrid>
+      <w:tr>
+        <w:tc>
+          <w:tcPr>
+            <w:tcW w:type="dxa" w:w="9026"/>
+            <w:tcBorders>
+              <w:top w:val="single" w:color="4CAF50" w:sz="2"/>
+              <w:left w:val="single" w:color="4CAF50" w:sz="2"/>
+              <w:bottom w:val="single" w:color="4CAF50" w:sz="2"/>
+              <w:right w:val="single" w:color="4CAF50" w:sz="2"/>
+            </w:tcBorders>
+            <w:shd w:fill="E8F5E9" w:val="clear"/>
+            <w:tcMar>
+              <w:top w:type="dxa" w:w="100"/>
+              <w:left w:type="dxa" w:w="200"/>
+              <w:bottom w:type="dxa" w:w="100"/>
+              <w:right w:type="dxa" w:w="200"/>
+            </w:tcMar>
+          </w:tcPr>
+          <w:p>
+            <w:pPr>
+              <w:spacing w:after="60"/>
+            </w:pPr>
+            <w:r>
+              <w:rPr>
+                <w:rFonts w:ascii="Arial" w:cs="Arial" w:eastAsia="Arial" w:hAnsi="Arial"/>
+                <w:b/>
+                <w:bCs/>
+                <w:color w:val="2E7D32"/>
+                <w:sz w:val="22"/>
+                <w:szCs w:val="22"/>
+              </w:rPr>
+              <w:t xml:space="preserve">ZOOM UT: </w:t>
+            </w:r>
+            <w:r>
+              <w:rPr>
+                <w:rFonts w:ascii="Arial" w:cs="Arial" w:eastAsia="Arial" w:hAnsi="Arial"/>
+                <w:i/>
+                <w:iCs/>
+                <w:color w:val="2E7D32"/>
+                <w:sz w:val="22"/>
+                <w:szCs w:val="22"/>
+              </w:rPr>
+              <w:t xml:space="preserve">En betalningsanmärkning gör att Alex inte kan teckna hyreskontrakt, mobilabonnemang eller lån i 3 år. Hur påverkar det framtida valmöjligheter? Är det proportionerligt att 2 200 kr kan stänga dörrar i 3 år?</w:t>
+            </w:r>
+          </w:p>
+        </w:tc>
+      </w:tr>
+    </w:tbl>
+    <w:p>
+      <w:r>
+        <w:br w:type="page"/>
+      </w:r>
+    </w:p>
+    <w:tbl>
+      <w:tblPr>
+        <w:tblW w:type="dxa" w:w="9026"/>
+        <w:tblBorders>
+          <w:top w:val="single" w:color="auto" w:sz="4"/>
+          <w:left w:val="single" w:color="auto" w:sz="4"/>
+          <w:bottom w:val="single" w:color="auto" w:sz="4"/>
+          <w:right w:val="single" w:color="auto" w:sz="4"/>
+          <w:insideH w:val="single" w:color="auto" w:sz="4"/>
+          <w:insideV w:val="single" w:color="auto" w:sz="4"/>
+        </w:tblBorders>
+      </w:tblPr>
+      <w:tblGrid>
+        <w:gridCol w:w="9026"/>
+      </w:tblGrid>
+      <w:tr>
+        <w:tc>
+          <w:tcPr>
+            <w:tcW w:type="dxa" w:w="9026"/>
+            <w:tcBorders>
+              <w:top w:val="single" w:color="E0A800" w:sz="2"/>
+              <w:left w:val="single" w:color="E0A800" w:sz="2"/>
+              <w:bottom w:val="single" w:color="E0A800" w:sz="2"/>
+              <w:right w:val="single" w:color="E0A800" w:sz="2"/>
+            </w:tcBorders>
+            <w:shd w:fill="FFF8E1" w:val="clear"/>
+            <w:tcMar>
+              <w:top w:type="dxa" w:w="120"/>
+              <w:left w:type="dxa" w:w="200"/>
+              <w:bottom w:type="dxa" w:w="120"/>
+              <w:right w:type="dxa" w:w="200"/>
+            </w:tcMar>
+          </w:tcPr>
+          <w:p>
+            <w:pPr>
+              <w:spacing w:after="120"/>
+            </w:pPr>
+            <w:r>
+              <w:rPr>
+                <w:rFonts w:ascii="Arial" w:cs="Arial" w:eastAsia="Arial" w:hAnsi="Arial"/>
+                <w:b/>
+                <w:bCs/>
+                <w:color w:val="B8860B"/>
+                <w:sz w:val="28"/>
+                <w:szCs w:val="28"/>
+              </w:rPr>
+              <w:t xml:space="preserve">Scenario 4: Systemfrågan — Zoom ut på alla tre scenarierna</w:t>
+            </w:r>
+          </w:p>
+          <w:p>
+            <w:pPr>
+              <w:spacing w:after="120"/>
+            </w:pPr>
+            <w:r>
+              <w:rPr>
+                <w:rFonts w:ascii="Arial" w:cs="Arial" w:eastAsia="Arial" w:hAnsi="Arial"/>
+                <w:sz w:val="24"/>
+                <w:szCs w:val="24"/>
+              </w:rPr>
+              <w:t xml:space="preserve">Alex kollega Fatima har gått igenom exakt samma kedja — tandläkare, nedskärning, skulder — men med en avgörande skillnad: Fatima är inhyrd via bemanningsföretag. Hon har ingen uppsägningstid, inga semesterdagar, ingen sjukpenning, och blev av med jobbet helt (inte bara nedskärning) samma vecka.</w:t>
+            </w:r>
+          </w:p>
+          <w:p>
+            <w:pPr>
+              <w:spacing w:after="80"/>
+            </w:pPr>
+            <w:r>
+              <w:rPr>
+                <w:rFonts w:ascii="Arial" w:cs="Arial" w:eastAsia="Arial" w:hAnsi="Arial"/>
+                <w:b/>
+                <w:bCs/>
+                <w:sz w:val="24"/>
+                <w:szCs w:val="24"/>
+              </w:rPr>
+              <w:t xml:space="preserve">Fakta att diskutera:</w:t>
+            </w:r>
+          </w:p>
+          <w:p>
+            <w:pPr>
+              <w:pStyle w:val="ListParagraph"/>
+              <w:numPr>
+                <w:ilvl w:val="0"/>
+                <w:numId w:val="2"/>
+              </w:numPr>
+              <w:spacing w:after="40"/>
+            </w:pPr>
+            <w:r>
+              <w:rPr>
+                <w:rFonts w:ascii="Arial" w:cs="Arial" w:eastAsia="Arial" w:hAnsi="Arial"/>
+                <w:sz w:val="24"/>
+                <w:szCs w:val="24"/>
+              </w:rPr>
+              <w:t xml:space="preserve">2023 hade 18% av unga 18–25 en betalningsanmärkning</w:t>
+            </w:r>
+          </w:p>
+          <w:p>
+            <w:pPr>
+              <w:pStyle w:val="ListParagraph"/>
+              <w:numPr>
+                <w:ilvl w:val="0"/>
+                <w:numId w:val="2"/>
+              </w:numPr>
+              <w:spacing w:after="40"/>
+            </w:pPr>
+            <w:r>
+              <w:rPr>
+                <w:rFonts w:ascii="Arial" w:cs="Arial" w:eastAsia="Arial" w:hAnsi="Arial"/>
+                <w:sz w:val="24"/>
+                <w:szCs w:val="24"/>
+              </w:rPr>
+              <w:t xml:space="preserve">Genomsnittlig skuld hos Kronofogden för unga: 89 000 kr</w:t>
+            </w:r>
+          </w:p>
+          <w:p>
+            <w:pPr>
+              <w:pStyle w:val="ListParagraph"/>
+              <w:numPr>
+                <w:ilvl w:val="0"/>
+                <w:numId w:val="2"/>
+              </w:numPr>
+              <w:spacing w:after="40"/>
+            </w:pPr>
+            <w:r>
+              <w:rPr>
+                <w:rFonts w:ascii="Arial" w:cs="Arial" w:eastAsia="Arial" w:hAnsi="Arial"/>
+                <w:sz w:val="24"/>
+                <w:szCs w:val="24"/>
+              </w:rPr>
+              <w:t xml:space="preserve">Snabblånebranschen omsätter ca 8 miljarder kr/år — med 30–40% ränta</w:t>
+            </w:r>
+          </w:p>
+          <w:p>
+            <w:pPr>
+              <w:pStyle w:val="ListParagraph"/>
+              <w:numPr>
+                <w:ilvl w:val="0"/>
+                <w:numId w:val="2"/>
+              </w:numPr>
+              <w:spacing w:after="120"/>
+            </w:pPr>
+            <w:r>
+              <w:rPr>
+                <w:rFonts w:ascii="Arial" w:cs="Arial" w:eastAsia="Arial" w:hAnsi="Arial"/>
+                <w:sz w:val="24"/>
+                <w:szCs w:val="24"/>
+              </w:rPr>
+              <w:t xml:space="preserve">Andelen unga med visstidsanställning: 55% (jämfört med 15% totalt)</w:t>
+            </w:r>
+          </w:p>
+          <w:p>
+            <w:pPr>
+              <w:spacing w:after="80"/>
+            </w:pPr>
+            <w:r>
+              <w:rPr>
+                <w:rFonts w:ascii="Arial" w:cs="Arial" w:eastAsia="Arial" w:hAnsi="Arial"/>
+                <w:b/>
+                <w:bCs/>
+                <w:sz w:val="24"/>
+                <w:szCs w:val="24"/>
+              </w:rPr>
+              <w:t xml:space="preserve">Perspektivövning — välj ETT perspektiv och argumentera:</w:t>
+            </w:r>
+          </w:p>
+          <w:p>
+            <w:pPr>
+              <w:pStyle w:val="ListParagraph"/>
+              <w:numPr>
+                <w:ilvl w:val="0"/>
+                <w:numId w:val="2"/>
+              </w:numPr>
+              <w:spacing w:after="60"/>
+            </w:pPr>
+            <w:r>
+              <w:rPr>
+                <w:rFonts w:ascii="Arial" w:cs="Arial" w:eastAsia="Arial" w:hAnsi="Arial"/>
+                <w:b/>
+                <w:bCs/>
+                <w:sz w:val="24"/>
+                <w:szCs w:val="24"/>
+              </w:rPr>
+              <w:t xml:space="preserve">Individperspektivet: </w:t>
+            </w:r>
+            <w:r>
+              <w:rPr>
+                <w:rFonts w:ascii="Arial" w:cs="Arial" w:eastAsia="Arial" w:hAnsi="Arial"/>
+                <w:sz w:val="24"/>
+                <w:szCs w:val="24"/>
+              </w:rPr>
+              <w:t xml:space="preserve">Alex borde ha sparat mer, sagt nej till Köpenhamn, och inte tagit snabblånet. Eget ansvar.</w:t>
+            </w:r>
+          </w:p>
+          <w:p>
+            <w:pPr>
+              <w:pStyle w:val="ListParagraph"/>
+              <w:numPr>
+                <w:ilvl w:val="0"/>
+                <w:numId w:val="2"/>
+              </w:numPr>
+              <w:spacing w:after="60"/>
+            </w:pPr>
+            <w:r>
+              <w:rPr>
+                <w:rFonts w:ascii="Arial" w:cs="Arial" w:eastAsia="Arial" w:hAnsi="Arial"/>
+                <w:b/>
+                <w:bCs/>
+                <w:sz w:val="24"/>
+                <w:szCs w:val="24"/>
+              </w:rPr>
+              <w:t xml:space="preserve">Företagsperspektivet: </w:t>
+            </w:r>
+            <w:r>
+              <w:rPr>
+                <w:rFonts w:ascii="Arial" w:cs="Arial" w:eastAsia="Arial" w:hAnsi="Arial"/>
+                <w:sz w:val="24"/>
+                <w:szCs w:val="24"/>
+              </w:rPr>
+              <w:t xml:space="preserve">Klarna och snabblåneföretagen erbjuder en tjänst folk efterfrågar. Arbetsgivaren måste anpassa efter marknaden.</w:t>
+            </w:r>
+          </w:p>
+          <w:p>
+            <w:pPr>
+              <w:pStyle w:val="ListParagraph"/>
+              <w:numPr>
+                <w:ilvl w:val="0"/>
+                <w:numId w:val="2"/>
+              </w:numPr>
+              <w:spacing w:after="120"/>
+            </w:pPr>
+            <w:r>
+              <w:rPr>
+                <w:rFonts w:ascii="Arial" w:cs="Arial" w:eastAsia="Arial" w:hAnsi="Arial"/>
+                <w:b/>
+                <w:bCs/>
+                <w:sz w:val="24"/>
+                <w:szCs w:val="24"/>
+              </w:rPr>
+              <w:t xml:space="preserve">Samhällsperspektivet: </w:t>
+            </w:r>
+            <w:r>
+              <w:rPr>
+                <w:rFonts w:ascii="Arial" w:cs="Arial" w:eastAsia="Arial" w:hAnsi="Arial"/>
+                <w:sz w:val="24"/>
+                <w:szCs w:val="24"/>
+              </w:rPr>
+              <w:t xml:space="preserve">Systemet är designat så att unga med låg inkomst och osäkra anställningar nästan oundvikligen hamnar i skuldfällan. Det krävs politiska åtgärder.</w:t>
+            </w:r>
+          </w:p>
+          <w:p>
+            <w:pPr>
+              <w:spacing w:after="80"/>
+            </w:pPr>
+            <w:r>
+              <w:rPr>
+                <w:rFonts w:ascii="Arial" w:cs="Arial" w:eastAsia="Arial" w:hAnsi="Arial"/>
+                <w:b/>
+                <w:bCs/>
+                <w:sz w:val="24"/>
+                <w:szCs w:val="24"/>
+              </w:rPr>
+              <w:t xml:space="preserve">Diskussionsfråga: </w:t>
+            </w:r>
+            <w:r>
+              <w:rPr>
+                <w:rFonts w:ascii="Arial" w:cs="Arial" w:eastAsia="Arial" w:hAnsi="Arial"/>
+                <w:i/>
+                <w:iCs/>
+                <w:sz w:val="24"/>
+                <w:szCs w:val="24"/>
+              </w:rPr>
+              <w:t xml:space="preserve">Tänk tillbaka på hela kedjan. Var i kedjan hade en annan struktur (högre ingångslön, billigare tandvård, förbud mot snabblån, tryggare anställning) kunnat bryta spiralen? Vilket ingrepp hade gett störst effekt?</w:t>
+            </w:r>
+          </w:p>
+        </w:tc>
+      </w:tr>
+    </w:tbl>
+    <w:p>
+      <w:pPr>
+        <w:spacing w:after="200"/>
+      </w:pPr>
+    </w:p>
+    <w:tbl>
+      <w:tblPr>
+        <w:tblW w:type="dxa" w:w="9026"/>
+        <w:tblBorders>
+          <w:top w:val="single" w:color="auto" w:sz="4"/>
+          <w:left w:val="single" w:color="auto" w:sz="4"/>
+          <w:bottom w:val="single" w:color="auto" w:sz="4"/>
+          <w:right w:val="single" w:color="auto" w:sz="4"/>
+          <w:insideH w:val="single" w:color="auto" w:sz="4"/>
+          <w:insideV w:val="single" w:color="auto" w:sz="4"/>
+        </w:tblBorders>
+      </w:tblPr>
+      <w:tblGrid>
+        <w:gridCol w:w="9026"/>
+      </w:tblGrid>
+      <w:tr>
+        <w:tc>
+          <w:tcPr>
+            <w:tcW w:type="dxa" w:w="9026"/>
+            <w:tcBorders>
+              <w:top w:val="single" w:color="4CAF50" w:sz="2"/>
+              <w:left w:val="single" w:color="4CAF50" w:sz="2"/>
+              <w:bottom w:val="single" w:color="4CAF50" w:sz="2"/>
+              <w:right w:val="single" w:color="4CAF50" w:sz="2"/>
+            </w:tcBorders>
+            <w:shd w:fill="E8F5E9" w:val="clear"/>
+            <w:tcMar>
+              <w:top w:type="dxa" w:w="100"/>
+              <w:left w:type="dxa" w:w="200"/>
+              <w:bottom w:type="dxa" w:w="100"/>
+              <w:right w:type="dxa" w:w="200"/>
+            </w:tcMar>
+          </w:tcPr>
+          <w:p>
+            <w:pPr>
+              <w:spacing w:after="60"/>
+            </w:pPr>
+            <w:r>
+              <w:rPr>
+                <w:rFonts w:ascii="Arial" w:cs="Arial" w:eastAsia="Arial" w:hAnsi="Arial"/>
+                <w:b/>
+                <w:bCs/>
+                <w:color w:val="2E7D32"/>
+                <w:sz w:val="22"/>
+                <w:szCs w:val="22"/>
+              </w:rPr>
+              <w:t xml:space="preserve">ZOOM UT: </w:t>
+            </w:r>
+            <w:r>
+              <w:rPr>
+                <w:rFonts w:ascii="Arial" w:cs="Arial" w:eastAsia="Arial" w:hAnsi="Arial"/>
+                <w:i/>
+                <w:iCs/>
+                <w:color w:val="2E7D32"/>
+                <w:sz w:val="22"/>
+                <w:szCs w:val="22"/>
+              </w:rPr>
+              <w:t xml:space="preserve">Om en generation unga hamnar i skuldspiralens logik — vad händer med bostadsmarknaden, konsumtionen, och i förlängningen skatteintäkterna? Rita kopplingen till det ekonomiska kretsloppet från lektion 1.</w:t>
+            </w:r>
+          </w:p>
+        </w:tc>
+      </w:tr>
+    </w:tbl>
+    <w:p>
+      <w:r>
+        <w:br w:type="page"/>
+      </w:r>
+    </w:p>
+    <w:p>
+      <w:pPr>
+        <w:pStyle w:val="Heading2"/>
+      </w:pPr>
+      <w:r>
+        <w:t xml:space="preserve">Lärarinstruktioner</w:t>
       </w:r>
     </w:p>
     <w:p>
@@ -896,10 +2181,20 @@
       <w:r>
         <w:rPr>
           <w:rFonts w:ascii="Arial" w:cs="Arial" w:eastAsia="Arial" w:hAnsi="Arial"/>
-          <w:sz w:val="24"/>
-          <w:szCs w:val="24"/>
-        </w:rPr>
-        <w:t xml:space="preserve">(A) Ta ett snabblån och fixa det direkt.</w:t>
+          <w:b/>
+          <w:bCs/>
+          <w:sz w:val="24"/>
+          <w:szCs w:val="24"/>
+        </w:rPr>
+        <w:t xml:space="preserve">Uppstart:</w:t>
+      </w:r>
+      <w:r>
+        <w:rPr>
+          <w:rFonts w:ascii="Arial" w:cs="Arial" w:eastAsia="Arial" w:hAnsi="Arial"/>
+          <w:sz w:val="24"/>
+          <w:szCs w:val="24"/>
+        </w:rPr>
+        <w:t xml:space="preserve"> Retrieval practice från lektion 3 — koppla direkt till budgetarbetet. “Hur mycket hade Alex kvar?” skapar en naturlig övergång till oväntade utgifter.</w:t>
       </w:r>
     </w:p>
     <w:p>
@@ -914,10 +2209,48 @@
       <w:r>
         <w:rPr>
           <w:rFonts w:ascii="Arial" w:cs="Arial" w:eastAsia="Arial" w:hAnsi="Arial"/>
-          <w:sz w:val="24"/>
-          <w:szCs w:val="24"/>
-        </w:rPr>
-        <w:t xml:space="preserve">(B) Vänta till lönen — men riskera att det blir värre och dyrare.</w:t>
+          <w:b/>
+          <w:bCs/>
+          <w:sz w:val="24"/>
+          <w:szCs w:val="24"/>
+        </w:rPr>
+        <w:t xml:space="preserve">Instruktion:</w:t>
+      </w:r>
+      <w:r>
+        <w:rPr>
+          <w:rFonts w:ascii="Arial" w:cs="Arial" w:eastAsia="Arial" w:hAnsi="Arial"/>
+          <w:sz w:val="24"/>
+          <w:szCs w:val="24"/>
+        </w:rPr>
+        <w:t xml:space="preserve"> Räkna konkret på tavlan: snabblån 10 000 kr × 35% ränta. Låt eleverna reagera på totalkostnaden. Håll det kort — den stora bearbetningen sker i scenariokedjan.</w:t>
+      </w:r>
+    </w:p>
+    <w:p>
+      <w:pPr>
+        <w:spacing w:after="120"/>
+      </w:pPr>
+      <w:r>
+        <w:rPr>
+          <w:rFonts w:ascii="Arial" w:cs="Arial" w:eastAsia="Arial" w:hAnsi="Arial"/>
+          <w:b/>
+          <w:bCs/>
+          <w:sz w:val="24"/>
+          <w:szCs w:val="24"/>
+        </w:rPr>
+        <w:t xml:space="preserve">Bearbetning:</w:t>
+      </w:r>
+    </w:p>
+    <w:p>
+      <w:pPr>
+        <w:spacing w:after="120"/>
+      </w:pPr>
+      <w:r>
+        <w:rPr>
+          <w:rFonts w:ascii="Arial" w:cs="Arial" w:eastAsia="Arial" w:hAnsi="Arial"/>
+          <w:sz w:val="24"/>
+          <w:szCs w:val="24"/>
+        </w:rPr>
+        <w:t xml:space="preserve">Scenarierna bildar en kedja — betona att paren måste arbeta i ordning eftersom varje val får konsekvenser i nästa scenario. Cirkulera och pusha:</w:t>
       </w:r>
     </w:p>
     <w:p>
@@ -932,10 +2265,20 @@
       <w:r>
         <w:rPr>
           <w:rFonts w:ascii="Arial" w:cs="Arial" w:eastAsia="Arial" w:hAnsi="Arial"/>
-          <w:sz w:val="24"/>
-          <w:szCs w:val="24"/>
-        </w:rPr>
-        <w:t xml:space="preserve">(C) Fråga föräldrarna om pengar.</w:t>
+          <w:i/>
+          <w:iCs/>
+          <w:sz w:val="24"/>
+          <w:szCs w:val="24"/>
+        </w:rPr>
+        <w:t xml:space="preserve">Scenario 1:</w:t>
+      </w:r>
+      <w:r>
+        <w:rPr>
+          <w:rFonts w:ascii="Arial" w:cs="Arial" w:eastAsia="Arial" w:hAnsi="Arial"/>
+          <w:sz w:val="24"/>
+          <w:szCs w:val="24"/>
+        </w:rPr>
+        <w:t xml:space="preserve"> "Vad händer med Alex buffertsparande om hen tar snabblånet? Hur påverkar det nästa situation?" (mot C)</w:t>
       </w:r>
     </w:p>
     <w:p>
@@ -950,175 +2293,20 @@
       <w:r>
         <w:rPr>
           <w:rFonts w:ascii="Arial" w:cs="Arial" w:eastAsia="Arial" w:hAnsi="Arial"/>
-          <w:sz w:val="24"/>
-          <w:szCs w:val="24"/>
-        </w:rPr>
-        <w:t xml:space="preserve">(D) Gå till en vårdcentral och se om det räknas som akutvård.</w:t>
-      </w:r>
-    </w:p>
-    <w:p>
-      <w:pPr>
-        <w:spacing w:after="120"/>
-      </w:pPr>
-      <w:r>
-        <w:rPr>
-          <w:rFonts w:ascii="Arial" w:cs="Arial" w:eastAsia="Arial" w:hAnsi="Arial"/>
-          <w:b/>
-          <w:bCs/>
           <w:i/>
           <w:iCs/>
           <w:sz w:val="24"/>
           <w:szCs w:val="24"/>
         </w:rPr>
-        <w:t xml:space="preserve">Diskussionsfråga: Alla har inte föräldrar som kan hjälpa till. Hur påverkar det Alex valmöjligheter? Är det rättvist?</w:t>
-      </w:r>
-    </w:p>
-    <w:p>
-      <w:pPr>
-        <w:spacing w:after="120"/>
-      </w:pPr>
-      <w:r>
-        <w:rPr>
-          <w:rFonts w:ascii="Arial" w:cs="Arial" w:eastAsia="Arial" w:hAnsi="Arial"/>
-          <w:b/>
-          <w:bCs/>
-          <w:sz w:val="26"/>
-          <w:szCs w:val="26"/>
-        </w:rPr>
-        <w:t xml:space="preserve">Scenario 2: Kompisen som behöver hjälp</w:t>
-      </w:r>
-    </w:p>
-    <w:p>
-      <w:pPr>
-        <w:spacing w:after="120"/>
-      </w:pPr>
-      <w:r>
-        <w:rPr>
-          <w:rFonts w:ascii="Arial" w:cs="Arial" w:eastAsia="Arial" w:hAnsi="Arial"/>
-          <w:sz w:val="24"/>
-          <w:szCs w:val="24"/>
-        </w:rPr>
-        <w:t xml:space="preserve">Alex kompis Dani har blivit av med sitt jobb och kan inte betala hyran. Dani frågar Alex om att låna 5 000 kr — “bara till nästa månad.” Alex har pengarna på sitt sparkonto, men det är hela buffertsparandet.</w:t>
-      </w:r>
-    </w:p>
-    <w:p>
-      <w:pPr>
-        <w:spacing w:after="120"/>
-      </w:pPr>
-      <w:r>
-        <w:rPr>
-          <w:rFonts w:ascii="Arial" w:cs="Arial" w:eastAsia="Arial" w:hAnsi="Arial"/>
-          <w:b/>
-          <w:bCs/>
-          <w:i/>
-          <w:iCs/>
-          <w:sz w:val="24"/>
-          <w:szCs w:val="24"/>
-        </w:rPr>
-        <w:t xml:space="preserve">Diskussionsfråga: Vad är skillnaden mellan att vara en bra vän och att fatta kloka ekonomiska beslut? Kan man vara båda?</w:t>
-      </w:r>
-    </w:p>
-    <w:p>
-      <w:pPr>
-        <w:spacing w:after="120"/>
-      </w:pPr>
-      <w:r>
-        <w:rPr>
-          <w:rFonts w:ascii="Arial" w:cs="Arial" w:eastAsia="Arial" w:hAnsi="Arial"/>
-          <w:b/>
-          <w:bCs/>
-          <w:sz w:val="26"/>
-          <w:szCs w:val="26"/>
-        </w:rPr>
-        <w:t xml:space="preserve">Scenario 3: "Alla andra har det"</w:t>
-      </w:r>
-    </w:p>
-    <w:p>
-      <w:pPr>
-        <w:spacing w:after="120"/>
-      </w:pPr>
-      <w:r>
-        <w:rPr>
-          <w:rFonts w:ascii="Arial" w:cs="Arial" w:eastAsia="Arial" w:hAnsi="Arial"/>
-          <w:sz w:val="24"/>
-          <w:szCs w:val="24"/>
-        </w:rPr>
-        <w:t xml:space="preserve">Alex jobbarkompisar åker på en weekend till Köpenhamn. Det kostar ca 4 000 kr. Alex har egentligen inte råd, men vill inte vara den som alltid säger nej. En kompis säger “lägg det på Klarna, betala senare.”</w:t>
-      </w:r>
-    </w:p>
-    <w:p>
-      <w:pPr>
-        <w:spacing w:after="120"/>
-      </w:pPr>
-      <w:r>
-        <w:rPr>
-          <w:rFonts w:ascii="Arial" w:cs="Arial" w:eastAsia="Arial" w:hAnsi="Arial"/>
-          <w:b/>
-          <w:bCs/>
-          <w:i/>
-          <w:iCs/>
-          <w:sz w:val="24"/>
-          <w:szCs w:val="24"/>
-        </w:rPr>
-        <w:t xml:space="preserve">Diskussionsfråga: Hur påverkar sociala förväntningar ekonomiska beslut? Är det ett individuellt problem eller ett samhällsproblem att företag som Klarna gör det lätt att skuldsätta sig?</w:t>
-      </w:r>
-    </w:p>
-    <w:p>
-      <w:pPr>
-        <w:spacing w:after="120"/>
-      </w:pPr>
-      <w:r>
-        <w:rPr>
-          <w:rFonts w:ascii="Arial" w:cs="Arial" w:eastAsia="Arial" w:hAnsi="Arial"/>
-          <w:b/>
-          <w:bCs/>
-          <w:sz w:val="26"/>
-          <w:szCs w:val="26"/>
-        </w:rPr>
-        <w:t xml:space="preserve">Scenario 4: Systemfrågan</w:t>
-      </w:r>
-    </w:p>
-    <w:p>
-      <w:pPr>
-        <w:spacing w:after="120"/>
-      </w:pPr>
-      <w:r>
-        <w:rPr>
-          <w:rFonts w:ascii="Arial" w:cs="Arial" w:eastAsia="Arial" w:hAnsi="Arial"/>
-          <w:sz w:val="24"/>
-          <w:szCs w:val="24"/>
-        </w:rPr>
-        <w:t xml:space="preserve">Alex kollega Fatima jobbar lika många timmar men får 2 000 kr mindre i månaden — hon är inhyrd via bemanningsföretag medan Alex är direktanställd. Fatima har inga semesterdagar och ingen sjukpenning.</w:t>
-      </w:r>
-    </w:p>
-    <w:p>
-      <w:pPr>
-        <w:spacing w:after="120"/>
-      </w:pPr>
-      <w:r>
-        <w:rPr>
-          <w:rFonts w:ascii="Arial" w:cs="Arial" w:eastAsia="Arial" w:hAnsi="Arial"/>
-          <w:b/>
-          <w:bCs/>
-          <w:i/>
-          <w:iCs/>
-          <w:sz w:val="24"/>
-          <w:szCs w:val="24"/>
-        </w:rPr>
-        <w:t xml:space="preserve">Diskussionsfråga: Är det rättvist? Vems ansvar är det att lösa det — Fatimas, företagets, fackets eller politikernas?</w:t>
-      </w:r>
-    </w:p>
-    <w:p>
-      <w:r>
-        <w:br w:type="page"/>
-      </w:r>
-    </w:p>
-    <w:p>
-      <w:pPr>
-        <w:pStyle w:val="Heading2"/>
-      </w:pPr>
-      <w:r>
-        <w:t xml:space="preserve">Lärarinstruktioner</w:t>
+        <w:t xml:space="preserve">Scenario 2:</w:t>
+      </w:r>
+      <w:r>
+        <w:rPr>
+          <w:rFonts w:ascii="Arial" w:cs="Arial" w:eastAsia="Arial" w:hAnsi="Arial"/>
+          <w:sz w:val="24"/>
+          <w:szCs w:val="24"/>
+        </w:rPr>
+        <w:t xml:space="preserve"> "Alex har redan en skuld ELLER ett tomt sparkonto — hur förändrar det valmöjligheterna?" (mot C/A)</w:t>
       </w:r>
     </w:p>
     <w:p>
@@ -1133,20 +2321,20 @@
       <w:r>
         <w:rPr>
           <w:rFonts w:ascii="Arial" w:cs="Arial" w:eastAsia="Arial" w:hAnsi="Arial"/>
-          <w:b/>
-          <w:bCs/>
-          <w:sz w:val="24"/>
-          <w:szCs w:val="24"/>
-        </w:rPr>
-        <w:t xml:space="preserve">Uppstart:</w:t>
-      </w:r>
-      <w:r>
-        <w:rPr>
-          <w:rFonts w:ascii="Arial" w:cs="Arial" w:eastAsia="Arial" w:hAnsi="Arial"/>
-          <w:sz w:val="24"/>
-          <w:szCs w:val="24"/>
-        </w:rPr>
-        <w:t xml:space="preserve"> Retrieval practice från lektion 3 — koppla direkt till budgetarbetet.</w:t>
+          <w:i/>
+          <w:iCs/>
+          <w:sz w:val="24"/>
+          <w:szCs w:val="24"/>
+        </w:rPr>
+        <w:t xml:space="preserve">Scenario 3:</w:t>
+      </w:r>
+      <w:r>
+        <w:rPr>
+          <w:rFonts w:ascii="Arial" w:cs="Arial" w:eastAsia="Arial" w:hAnsi="Arial"/>
+          <w:sz w:val="24"/>
+          <w:szCs w:val="24"/>
+        </w:rPr>
+        <w:t xml:space="preserve"> "Nu har Alex flera ekonomiska problem samtidigt — vad gör det med beslutskvaliteten?" (mot A)</w:t>
       </w:r>
     </w:p>
     <w:p>
@@ -1161,20 +2349,20 @@
       <w:r>
         <w:rPr>
           <w:rFonts w:ascii="Arial" w:cs="Arial" w:eastAsia="Arial" w:hAnsi="Arial"/>
-          <w:b/>
-          <w:bCs/>
-          <w:sz w:val="24"/>
-          <w:szCs w:val="24"/>
-        </w:rPr>
-        <w:t xml:space="preserve">Instruktion:</w:t>
-      </w:r>
-      <w:r>
-        <w:rPr>
-          <w:rFonts w:ascii="Arial" w:cs="Arial" w:eastAsia="Arial" w:hAnsi="Arial"/>
-          <w:sz w:val="24"/>
-          <w:szCs w:val="24"/>
-        </w:rPr>
-        <w:t xml:space="preserve"> Räkna konkret: snabblån 10 000 kr × 35% ränta. Låt eleverna reagera.</w:t>
+          <w:i/>
+          <w:iCs/>
+          <w:sz w:val="24"/>
+          <w:szCs w:val="24"/>
+        </w:rPr>
+        <w:t xml:space="preserve">Scenario 4 (Zoom ut):</w:t>
+      </w:r>
+      <w:r>
+        <w:rPr>
+          <w:rFonts w:ascii="Arial" w:cs="Arial" w:eastAsia="Arial" w:hAnsi="Arial"/>
+          <w:sz w:val="24"/>
+          <w:szCs w:val="24"/>
+        </w:rPr>
+        <w:t xml:space="preserve"> "Sluta tänka på Alex. Tänk på 100 000 unga i samma situation." (mot A)</w:t>
       </w:r>
     </w:p>
     <w:p>
@@ -1194,15 +2382,23 @@
           <w:sz w:val="24"/>
           <w:szCs w:val="24"/>
         </w:rPr>
-        <w:t xml:space="preserve">Bearbetning:</w:t>
-      </w:r>
-      <w:r>
-        <w:rPr>
-          <w:rFonts w:ascii="Arial" w:cs="Arial" w:eastAsia="Arial" w:hAnsi="Arial"/>
-          <w:sz w:val="24"/>
-          <w:szCs w:val="24"/>
-        </w:rPr>
-        <w:t xml:space="preserve"> Scenarierna är designade att skapa oenighet — uppmuntra det! Pusha: “Spelar det roll att Alex inte har föräldrar som kan hjälpa?” (scenario 1, mot C/A). “Är Klarna problemet — eller är det sociala förväntningar?” (scenario 3, mot A).</w:t>
+        <w:t xml:space="preserve">Summering:</w:t>
+      </w:r>
+      <w:r>
+        <w:rPr>
+          <w:rFonts w:ascii="Arial" w:cs="Arial" w:eastAsia="Arial" w:hAnsi="Arial"/>
+          <w:sz w:val="24"/>
+          <w:szCs w:val="24"/>
+        </w:rPr>
+        <w:t xml:space="preserve"> Jämför kedjorna — par som tog snabblånet tidigt hade sannolikt sämre förutsättningar i scenario 3–4. Poängen: ekonomiska beslut är kumulativa, inte isolerade. Fråga: "Var det Alex dåliga val — eller dåliga förutsättningar — som ledde hit?"</w:t>
+      </w:r>
+    </w:p>
+    <w:p>
+      <w:pPr>
+        <w:pStyle w:val="Heading2"/>
+      </w:pPr>
+      <w:r>
+        <w:t xml:space="preserve">Differentiering</w:t>
       </w:r>
     </w:p>
     <w:p>
@@ -1222,23 +2418,15 @@
           <w:sz w:val="24"/>
           <w:szCs w:val="24"/>
         </w:rPr>
-        <w:t xml:space="preserve">Summering:</w:t>
-      </w:r>
-      <w:r>
-        <w:rPr>
-          <w:rFonts w:ascii="Arial" w:cs="Arial" w:eastAsia="Arial" w:hAnsi="Arial"/>
-          <w:sz w:val="24"/>
-          <w:szCs w:val="24"/>
-        </w:rPr>
-        <w:t xml:space="preserve"> Lyft det scenario som skapade mest debatt. Ekonomiska beslut är aldrig bara rationella — de påverkas av relationer, normer och vilka resurser man har.</w:t>
-      </w:r>
-    </w:p>
-    <w:p>
-      <w:pPr>
-        <w:pStyle w:val="Heading2"/>
-      </w:pPr>
-      <w:r>
-        <w:t xml:space="preserve">Differentiering</w:t>
+        <w:t xml:space="preserve">Stöd (mot E):</w:t>
+      </w:r>
+      <w:r>
+        <w:rPr>
+          <w:rFonts w:ascii="Arial" w:cs="Arial" w:eastAsia="Arial" w:hAnsi="Arial"/>
+          <w:sz w:val="24"/>
+          <w:szCs w:val="24"/>
+        </w:rPr>
+        <w:t xml:space="preserve"> Stödfrågor på varje kort: "Vilka alternativ har Alex?" och "Vad händer om Alex väljer alternativ A? Alternativ B?" Eleverna fokuserar på diskussionsfrågan och hoppar över "Zoom ut"-frågan. Scenario 4 kan göras muntligt i helklass.</w:t>
       </w:r>
     </w:p>
     <w:p>
@@ -1258,15 +2446,23 @@
           <w:sz w:val="24"/>
           <w:szCs w:val="24"/>
         </w:rPr>
-        <w:t xml:space="preserve">Stöd (mot E):</w:t>
-      </w:r>
-      <w:r>
-        <w:rPr>
-          <w:rFonts w:ascii="Arial" w:cs="Arial" w:eastAsia="Arial" w:hAnsi="Arial"/>
-          <w:sz w:val="24"/>
-          <w:szCs w:val="24"/>
-        </w:rPr>
-        <w:t xml:space="preserve"> Varje scenariokort har stödfrågor: "Vilka alternativ har Alex?" och "Vad händer om Alex väljer alternativ A? Alternativ B?"</w:t>
+        <w:t xml:space="preserve">Utmaning (mot A):</w:t>
+      </w:r>
+      <w:r>
+        <w:rPr>
+          <w:rFonts w:ascii="Arial" w:cs="Arial" w:eastAsia="Arial" w:hAnsi="Arial"/>
+          <w:sz w:val="24"/>
+          <w:szCs w:val="24"/>
+        </w:rPr>
+        <w:t xml:space="preserve"> Eleverna besvarar ALLA "Zoom ut"-frågor skriftligt. I scenario 4: argumentera från ETT perspektiv i 5 minuter, byt sedan till ett annat perspektiv och argumentera lika övertygande. Reflektera: "Vilket perspektiv var svårast att försvara — och varför?"</w:t>
+      </w:r>
+    </w:p>
+    <w:p>
+      <w:pPr>
+        <w:pStyle w:val="Heading2"/>
+      </w:pPr>
+      <w:r>
+        <w:t xml:space="preserve">Koppling till kunskapskrav</w:t>
       </w:r>
     </w:p>
     <w:p>
@@ -1286,23 +2482,15 @@
           <w:sz w:val="24"/>
           <w:szCs w:val="24"/>
         </w:rPr>
-        <w:t xml:space="preserve">Utmaning (mot A):</w:t>
-      </w:r>
-      <w:r>
-        <w:rPr>
-          <w:rFonts w:ascii="Arial" w:cs="Arial" w:eastAsia="Arial" w:hAnsi="Arial"/>
-          <w:sz w:val="24"/>
-          <w:szCs w:val="24"/>
-        </w:rPr>
-        <w:t xml:space="preserve"> "Diskutera frågan ur både individens och samhällets perspektiv. Föreslå en politisk åtgärd som skulle kunna förebygga situationen."</w:t>
-      </w:r>
-    </w:p>
-    <w:p>
-      <w:pPr>
-        <w:pStyle w:val="Heading2"/>
-      </w:pPr>
-      <w:r>
-        <w:t xml:space="preserve">Koppling till kunskapskrav</w:t>
+        <w:t xml:space="preserve">E-nivå:</w:t>
+      </w:r>
+      <w:r>
+        <w:rPr>
+          <w:rFonts w:ascii="Arial" w:cs="Arial" w:eastAsia="Arial" w:hAnsi="Arial"/>
+          <w:sz w:val="24"/>
+          <w:szCs w:val="24"/>
+        </w:rPr>
+        <w:t xml:space="preserve"> Identifiera alternativ och ge enkla resonemang om konsekvenser av ekonomiska val.</w:t>
       </w:r>
     </w:p>
     <w:p>
@@ -1322,15 +2510,15 @@
           <w:sz w:val="24"/>
           <w:szCs w:val="24"/>
         </w:rPr>
-        <w:t xml:space="preserve">E-nivå:</w:t>
-      </w:r>
-      <w:r>
-        <w:rPr>
-          <w:rFonts w:ascii="Arial" w:cs="Arial" w:eastAsia="Arial" w:hAnsi="Arial"/>
-          <w:sz w:val="24"/>
-          <w:szCs w:val="24"/>
-        </w:rPr>
-        <w:t xml:space="preserve"> Identifiera alternativ och ge enkla resonemang om konsekvenser av ekonomiska val.</w:t>
+        <w:t xml:space="preserve">C-nivå:</w:t>
+      </w:r>
+      <w:r>
+        <w:rPr>
+          <w:rFonts w:ascii="Arial" w:cs="Arial" w:eastAsia="Arial" w:hAnsi="Arial"/>
+          <w:sz w:val="24"/>
+          <w:szCs w:val="24"/>
+        </w:rPr>
+        <w:t xml:space="preserve"> Föra välgrundade resonemang om kort- och långsiktiga konsekvenser och visa på samband.</w:t>
       </w:r>
     </w:p>
     <w:p>
@@ -1350,34 +2538,6 @@
           <w:sz w:val="24"/>
           <w:szCs w:val="24"/>
         </w:rPr>
-        <w:t xml:space="preserve">C-nivå:</w:t>
-      </w:r>
-      <w:r>
-        <w:rPr>
-          <w:rFonts w:ascii="Arial" w:cs="Arial" w:eastAsia="Arial" w:hAnsi="Arial"/>
-          <w:sz w:val="24"/>
-          <w:szCs w:val="24"/>
-        </w:rPr>
-        <w:t xml:space="preserve"> Föra välgrundade resonemang om kort- och långsiktiga konsekvenser och visa på samband.</w:t>
-      </w:r>
-    </w:p>
-    <w:p>
-      <w:pPr>
-        <w:pStyle w:val="ListParagraph"/>
-        <w:numPr>
-          <w:ilvl w:val="0"/>
-          <w:numId w:val="2"/>
-        </w:numPr>
-        <w:spacing w:after="60"/>
-      </w:pPr>
-      <w:r>
-        <w:rPr>
-          <w:rFonts w:ascii="Arial" w:cs="Arial" w:eastAsia="Arial" w:hAnsi="Arial"/>
-          <w:b/>
-          <w:bCs/>
-          <w:sz w:val="24"/>
-          <w:szCs w:val="24"/>
-        </w:rPr>
         <w:t xml:space="preserve">A-nivå:</w:t>
       </w:r>
       <w:r>
@@ -1386,7 +2546,7 @@
           <w:sz w:val="24"/>
           <w:szCs w:val="24"/>
         </w:rPr>
-        <w:t xml:space="preserve"> Föra välgrundade och nyanserade resonemang ur flera perspektiv och visa på komplexa samband mellan privatekonomi och samhällsekonomi.</w:t>
+        <w:t xml:space="preserve"> Föra välgrundade och nyanserade resonemang ur flera perspektiv (individ, företag, samhälle) och visa på komplexa samband mellan privatekonomi och samhällsekonomi.</w:t>
       </w:r>
     </w:p>
     <w:sectPr>
@@ -1612,6 +2772,18 @@
       <w:start w:val="1"/>
       <w:numFmt w:val="bullet"/>
       <w:lvlText w:val="•"/>
+      <w:lvlJc w:val="left"/>
+      <w:pPr>
+        <w:ind w:left="720" w:hanging="360"/>
+      </w:pPr>
+    </w:lvl>
+  </w:abstractNum>
+  <w:abstractNum w:abstractNumId="3" w15:restartNumberingAfterBreak="0">
+    <w:multiLevelType w:val="hybridMultilevel"/>
+    <w:lvl w:ilvl="0" w15:tentative="1">
+      <w:start w:val="1"/>
+      <w:numFmt w:val="upperLetter"/>
+      <w:lvlText w:val="(%1)"/>
       <w:lvlJc w:val="left"/>
       <w:pPr>
         <w:ind w:left="720" w:hanging="360"/>

</xml_diff>